<commit_message>
Update AquiferOpenStudyNotes content for 2026-10-20 release
</commit_message>
<xml_diff>
--- a/arb/docx/02.content.docx
+++ b/arb/docx/02.content.docx
@@ -16173,23 +16173,7 @@
           <w:cs/>
           <w:lang w:val="ar_AE" w:bidi="ar_AE"/>
         </w:rPr>
-        <w:t xml:space="preserve">; انظر المزيد </w:t>
-      </w:r>
-      <w:r>
-        <w:rPr>
-          <w:rtl/>
-          <w:cs/>
-          <w:lang w:val="ar_AE" w:bidi="ar_AE"/>
-        </w:rPr>
-        <w:t>مقدمة سفر الخروج</w:t>
-      </w:r>
-      <w:r>
-        <w:rPr>
-          <w:rtl/>
-          <w:cs/>
-          <w:lang w:val="ar_AE" w:bidi="ar_AE"/>
-        </w:rPr>
-        <w:t>، تاريخ الخروج.</w:t>
+        <w:t>; انظر المزيد مقدمة سفر الخروج، تاريخ الخروج.</w:t>
       </w:r>
       <w:r>
         <w:rPr>

</xml_diff>